<commit_message>
Reorder DataSET.docx sections for supervisor presentation.
EOF
</commit_message>
<xml_diff>
--- a/DataSET.docx
+++ b/DataSET.docx
@@ -85,6 +85,7 @@
       </w:pPr>
       <w:r>
         <w:rPr>
+          <w:noProof/>
           <w:lang w:val="en-US"/>
         </w:rPr>
         <w:drawing>
@@ -132,6 +133,7 @@
       </w:pPr>
       <w:r>
         <w:rPr>
+          <w:noProof/>
           <w:lang w:val="en-US"/>
         </w:rPr>
         <w:drawing>
@@ -229,6 +231,7 @@
       </w:pPr>
       <w:r>
         <w:rPr>
+          <w:noProof/>
           <w:lang w:val="en-US"/>
         </w:rPr>
         <w:drawing>
@@ -557,6 +560,7 @@
         <w:rPr>
           <w:lang w:val="en-US"/>
         </w:rPr>
+        <w:lastRenderedPageBreak/>
         <w:t>MultiSenNA:15 Class</w:t>
       </w:r>
     </w:p>
@@ -585,7 +589,6 @@
           <w:b/>
           <w:bCs/>
         </w:rPr>
-        <w:lastRenderedPageBreak/>
         <w:t>1B · Baseline</w:t>
       </w:r>
       <w:r>
@@ -1759,13 +1762,13 @@
         <w:tblLook w:val="04A0" w:firstRow="1" w:lastRow="0" w:firstColumn="1" w:lastColumn="0" w:noHBand="0" w:noVBand="1"/>
       </w:tblPr>
       <w:tblGrid>
-        <w:gridCol w:w="4487"/>
-        <w:gridCol w:w="4529"/>
+        <w:gridCol w:w="2122"/>
+        <w:gridCol w:w="6894"/>
       </w:tblGrid>
       <w:tr>
         <w:tc>
           <w:tcPr>
-            <w:tcW w:w="4824" w:type="dxa"/>
+            <w:tcW w:w="2122" w:type="dxa"/>
           </w:tcPr>
           <w:p>
             <w:r>
@@ -1780,7 +1783,7 @@
         </w:tc>
         <w:tc>
           <w:tcPr>
-            <w:tcW w:w="4824" w:type="dxa"/>
+            <w:tcW w:w="6894" w:type="dxa"/>
           </w:tcPr>
           <w:p>
             <w:r>
@@ -1797,7 +1800,7 @@
       <w:tr>
         <w:tc>
           <w:tcPr>
-            <w:tcW w:w="4824" w:type="dxa"/>
+            <w:tcW w:w="2122" w:type="dxa"/>
           </w:tcPr>
           <w:p>
             <w:r>
@@ -1811,7 +1814,7 @@
         </w:tc>
         <w:tc>
           <w:tcPr>
-            <w:tcW w:w="4824" w:type="dxa"/>
+            <w:tcW w:w="6894" w:type="dxa"/>
           </w:tcPr>
           <w:p>
             <w:r>
@@ -1850,7 +1853,7 @@
       <w:tr>
         <w:tc>
           <w:tcPr>
-            <w:tcW w:w="4824" w:type="dxa"/>
+            <w:tcW w:w="2122" w:type="dxa"/>
           </w:tcPr>
           <w:p>
             <w:r>
@@ -1864,7 +1867,7 @@
         </w:tc>
         <w:tc>
           <w:tcPr>
-            <w:tcW w:w="4824" w:type="dxa"/>
+            <w:tcW w:w="6894" w:type="dxa"/>
           </w:tcPr>
           <w:p>
             <w:r>
@@ -1896,7 +1899,7 @@
       <w:tr>
         <w:tc>
           <w:tcPr>
-            <w:tcW w:w="4824" w:type="dxa"/>
+            <w:tcW w:w="2122" w:type="dxa"/>
           </w:tcPr>
           <w:p>
             <w:r>
@@ -1910,7 +1913,7 @@
         </w:tc>
         <w:tc>
           <w:tcPr>
-            <w:tcW w:w="4824" w:type="dxa"/>
+            <w:tcW w:w="6894" w:type="dxa"/>
           </w:tcPr>
           <w:p>
             <w:r>
@@ -1956,7 +1959,7 @@
       <w:tr>
         <w:tc>
           <w:tcPr>
-            <w:tcW w:w="4824" w:type="dxa"/>
+            <w:tcW w:w="2122" w:type="dxa"/>
           </w:tcPr>
           <w:p>
             <w:r>
@@ -1970,7 +1973,7 @@
         </w:tc>
         <w:tc>
           <w:tcPr>
-            <w:tcW w:w="4824" w:type="dxa"/>
+            <w:tcW w:w="6894" w:type="dxa"/>
           </w:tcPr>
           <w:p>
             <w:r>
@@ -2221,6 +2224,9 @@
     <w:p>
       <w:pPr>
         <w:spacing w:after="120"/>
+        <w:rPr>
+          <w:rFonts w:ascii="Calibri" w:hAnsi="Calibri"/>
+        </w:rPr>
       </w:pPr>
       <w:r>
         <w:rPr>
@@ -2262,6 +2268,11 @@
         </w:rPr>
         <w:t>; heavy multitemporal S1+S2 CNNs came in follow-ups.</w:t>
       </w:r>
+    </w:p>
+    <w:p>
+      <w:pPr>
+        <w:spacing w:after="120"/>
+      </w:pPr>
     </w:p>
     <w:p>
       <w:pPr>
@@ -2326,13 +2337,7 @@
         <w:rPr>
           <w:rFonts w:ascii="Calibri" w:hAnsi="Calibri"/>
         </w:rPr>
-        <w:t>https://doi.org/10.3390/rs15010151</w:t>
-      </w:r>
-      <w:r>
-        <w:rPr>
-          <w:rFonts w:ascii="Calibri" w:hAnsi="Calibri"/>
-        </w:rPr>
-        <w:t>)</w:t>
+        <w:t>https://doi.org/10.3390/rs15010151)</w:t>
       </w:r>
     </w:p>
     <w:tbl>
@@ -2342,13 +2347,13 @@
         <w:tblLook w:val="04A0" w:firstRow="1" w:lastRow="0" w:firstColumn="1" w:lastColumn="0" w:noHBand="0" w:noVBand="1"/>
       </w:tblPr>
       <w:tblGrid>
-        <w:gridCol w:w="4458"/>
-        <w:gridCol w:w="4558"/>
+        <w:gridCol w:w="2122"/>
+        <w:gridCol w:w="6894"/>
       </w:tblGrid>
       <w:tr>
         <w:tc>
           <w:tcPr>
-            <w:tcW w:w="4824" w:type="dxa"/>
+            <w:tcW w:w="2122" w:type="dxa"/>
           </w:tcPr>
           <w:p>
             <w:r>
@@ -2363,7 +2368,7 @@
         </w:tc>
         <w:tc>
           <w:tcPr>
-            <w:tcW w:w="4824" w:type="dxa"/>
+            <w:tcW w:w="6894" w:type="dxa"/>
           </w:tcPr>
           <w:p>
             <w:r>
@@ -2380,7 +2385,7 @@
       <w:tr>
         <w:tc>
           <w:tcPr>
-            <w:tcW w:w="4824" w:type="dxa"/>
+            <w:tcW w:w="2122" w:type="dxa"/>
           </w:tcPr>
           <w:p>
             <w:r>
@@ -2394,7 +2399,7 @@
         </w:tc>
         <w:tc>
           <w:tcPr>
-            <w:tcW w:w="4824" w:type="dxa"/>
+            <w:tcW w:w="6894" w:type="dxa"/>
           </w:tcPr>
           <w:p>
             <w:r>
@@ -2418,7 +2423,7 @@
       <w:tr>
         <w:tc>
           <w:tcPr>
-            <w:tcW w:w="4824" w:type="dxa"/>
+            <w:tcW w:w="2122" w:type="dxa"/>
           </w:tcPr>
           <w:p>
             <w:r>
@@ -2432,7 +2437,7 @@
         </w:tc>
         <w:tc>
           <w:tcPr>
-            <w:tcW w:w="4824" w:type="dxa"/>
+            <w:tcW w:w="6894" w:type="dxa"/>
           </w:tcPr>
           <w:p>
             <w:r>
@@ -2449,7 +2454,7 @@
       <w:tr>
         <w:tc>
           <w:tcPr>
-            <w:tcW w:w="4824" w:type="dxa"/>
+            <w:tcW w:w="2122" w:type="dxa"/>
           </w:tcPr>
           <w:p>
             <w:r>
@@ -2463,7 +2468,7 @@
         </w:tc>
         <w:tc>
           <w:tcPr>
-            <w:tcW w:w="4824" w:type="dxa"/>
+            <w:tcW w:w="6894" w:type="dxa"/>
           </w:tcPr>
           <w:p>
             <w:r>
@@ -2524,7 +2529,7 @@
       <w:tr>
         <w:tc>
           <w:tcPr>
-            <w:tcW w:w="4824" w:type="dxa"/>
+            <w:tcW w:w="2122" w:type="dxa"/>
           </w:tcPr>
           <w:p>
             <w:r>
@@ -2538,7 +2543,7 @@
         </w:tc>
         <w:tc>
           <w:tcPr>
-            <w:tcW w:w="4824" w:type="dxa"/>
+            <w:tcW w:w="6894" w:type="dxa"/>
           </w:tcPr>
           <w:p>
             <w:r>
@@ -2584,7 +2589,7 @@
       <w:tr>
         <w:tc>
           <w:tcPr>
-            <w:tcW w:w="4824" w:type="dxa"/>
+            <w:tcW w:w="2122" w:type="dxa"/>
           </w:tcPr>
           <w:p>
             <w:r>
@@ -2598,7 +2603,7 @@
         </w:tc>
         <w:tc>
           <w:tcPr>
-            <w:tcW w:w="4824" w:type="dxa"/>
+            <w:tcW w:w="6894" w:type="dxa"/>
           </w:tcPr>
           <w:p>
             <w:r>
@@ -2758,25 +2763,7 @@
         <w:rPr>
           <w:rFonts w:ascii="Calibri" w:hAnsi="Calibri"/>
         </w:rPr>
-        <w:t xml:space="preserve">, Remote Sensing Letters, 2025. </w:t>
-      </w:r>
-      <w:r>
-        <w:rPr>
-          <w:rFonts w:ascii="Calibri" w:hAnsi="Calibri"/>
-        </w:rPr>
-        <w:t>(</w:t>
-      </w:r>
-      <w:r>
-        <w:rPr>
-          <w:rFonts w:ascii="Calibri" w:hAnsi="Calibri"/>
-        </w:rPr>
-        <w:t>https://germain-forestier.info/publis/rsl2025.pdf</w:t>
-      </w:r>
-      <w:r>
-        <w:rPr>
-          <w:rFonts w:ascii="Calibri" w:hAnsi="Calibri"/>
-        </w:rPr>
-        <w:t>)</w:t>
+        <w:t>, Remote Sensing Letters, 2025. (https://germain-forestier.info/publis/rsl2025.pdf)</w:t>
       </w:r>
     </w:p>
     <w:p>
@@ -2835,21 +2822,21 @@
         <w:tblLook w:val="04A0" w:firstRow="1" w:lastRow="0" w:firstColumn="1" w:lastColumn="0" w:noHBand="0" w:noVBand="1"/>
       </w:tblPr>
       <w:tblGrid>
-        <w:gridCol w:w="2279"/>
-        <w:gridCol w:w="2231"/>
-        <w:gridCol w:w="2250"/>
-        <w:gridCol w:w="2256"/>
+        <w:gridCol w:w="3964"/>
+        <w:gridCol w:w="1701"/>
+        <w:gridCol w:w="1418"/>
+        <w:gridCol w:w="1933"/>
       </w:tblGrid>
       <w:tr>
         <w:tc>
           <w:tcPr>
-            <w:tcW w:w="2412" w:type="dxa"/>
+            <w:tcW w:w="3964" w:type="dxa"/>
           </w:tcPr>
           <w:p/>
         </w:tc>
         <w:tc>
           <w:tcPr>
-            <w:tcW w:w="2412" w:type="dxa"/>
+            <w:tcW w:w="1701" w:type="dxa"/>
           </w:tcPr>
           <w:p>
             <w:r>
@@ -2864,7 +2851,7 @@
         </w:tc>
         <w:tc>
           <w:tcPr>
-            <w:tcW w:w="2412" w:type="dxa"/>
+            <w:tcW w:w="1418" w:type="dxa"/>
           </w:tcPr>
           <w:p>
             <w:r>
@@ -2879,7 +2866,7 @@
         </w:tc>
         <w:tc>
           <w:tcPr>
-            <w:tcW w:w="2412" w:type="dxa"/>
+            <w:tcW w:w="1933" w:type="dxa"/>
           </w:tcPr>
           <w:p>
             <w:r>
@@ -2896,7 +2883,7 @@
       <w:tr>
         <w:tc>
           <w:tcPr>
-            <w:tcW w:w="2412" w:type="dxa"/>
+            <w:tcW w:w="3964" w:type="dxa"/>
           </w:tcPr>
           <w:p>
             <w:r>
@@ -2943,7 +2930,7 @@
         </w:tc>
         <w:tc>
           <w:tcPr>
-            <w:tcW w:w="2412" w:type="dxa"/>
+            <w:tcW w:w="1701" w:type="dxa"/>
           </w:tcPr>
           <w:p>
             <w:r>
@@ -2957,7 +2944,7 @@
         </w:tc>
         <w:tc>
           <w:tcPr>
-            <w:tcW w:w="2412" w:type="dxa"/>
+            <w:tcW w:w="1418" w:type="dxa"/>
           </w:tcPr>
           <w:p>
             <w:r>
@@ -2972,7 +2959,7 @@
         </w:tc>
         <w:tc>
           <w:tcPr>
-            <w:tcW w:w="2412" w:type="dxa"/>
+            <w:tcW w:w="1933" w:type="dxa"/>
           </w:tcPr>
           <w:p>
             <w:r>
@@ -2989,7 +2976,7 @@
       <w:tr>
         <w:tc>
           <w:tcPr>
-            <w:tcW w:w="2412" w:type="dxa"/>
+            <w:tcW w:w="3964" w:type="dxa"/>
           </w:tcPr>
           <w:p>
             <w:r>
@@ -3036,7 +3023,7 @@
         </w:tc>
         <w:tc>
           <w:tcPr>
-            <w:tcW w:w="2412" w:type="dxa"/>
+            <w:tcW w:w="1701" w:type="dxa"/>
           </w:tcPr>
           <w:p>
             <w:r>
@@ -3050,7 +3037,7 @@
         </w:tc>
         <w:tc>
           <w:tcPr>
-            <w:tcW w:w="2412" w:type="dxa"/>
+            <w:tcW w:w="1418" w:type="dxa"/>
           </w:tcPr>
           <w:p>
             <w:r>
@@ -3065,7 +3052,7 @@
         </w:tc>
         <w:tc>
           <w:tcPr>
-            <w:tcW w:w="2412" w:type="dxa"/>
+            <w:tcW w:w="1933" w:type="dxa"/>
           </w:tcPr>
           <w:p>
             <w:r>
@@ -3082,22 +3069,21 @@
       <w:tr>
         <w:tc>
           <w:tcPr>
-            <w:tcW w:w="2412" w:type="dxa"/>
-          </w:tcPr>
-          <w:p>
-            <w:r>
-              <w:rPr>
-                <w:rFonts w:ascii="Calibri" w:hAnsi="Calibri"/>
-                <w:sz w:val="20"/>
-              </w:rPr>
-              <w:lastRenderedPageBreak/>
+            <w:tcW w:w="3964" w:type="dxa"/>
+          </w:tcPr>
+          <w:p>
+            <w:r>
+              <w:rPr>
+                <w:rFonts w:ascii="Calibri" w:hAnsi="Calibri"/>
+                <w:sz w:val="20"/>
+              </w:rPr>
               <w:t>Urban only (classes 1–5) weighted F1, full data</w:t>
             </w:r>
           </w:p>
         </w:tc>
         <w:tc>
           <w:tcPr>
-            <w:tcW w:w="2412" w:type="dxa"/>
+            <w:tcW w:w="1701" w:type="dxa"/>
           </w:tcPr>
           <w:p>
             <w:r>
@@ -3111,7 +3097,7 @@
         </w:tc>
         <w:tc>
           <w:tcPr>
-            <w:tcW w:w="2412" w:type="dxa"/>
+            <w:tcW w:w="1418" w:type="dxa"/>
           </w:tcPr>
           <w:p>
             <w:r>
@@ -3125,7 +3111,7 @@
         </w:tc>
         <w:tc>
           <w:tcPr>
-            <w:tcW w:w="2412" w:type="dxa"/>
+            <w:tcW w:w="1933" w:type="dxa"/>
           </w:tcPr>
           <w:p>
             <w:r>
@@ -3173,7 +3159,21 @@
           <w:rFonts w:ascii="Calibri" w:hAnsi="Calibri"/>
           <w:b/>
         </w:rPr>
-        <w:t>Contrast with you:</w:t>
+        <w:t xml:space="preserve">Contrast with </w:t>
+      </w:r>
+      <w:r>
+        <w:rPr>
+          <w:rFonts w:ascii="Calibri" w:hAnsi="Calibri"/>
+          <w:b/>
+        </w:rPr>
+        <w:t>LULCDial-s1</w:t>
+      </w:r>
+      <w:r>
+        <w:rPr>
+          <w:rFonts w:ascii="Calibri" w:hAnsi="Calibri"/>
+          <w:b/>
+        </w:rPr>
+        <w:t>:</w:t>
       </w:r>
     </w:p>
     <w:tbl>
@@ -3183,20 +3183,20 @@
         <w:tblLook w:val="04A0" w:firstRow="1" w:lastRow="0" w:firstColumn="1" w:lastColumn="0" w:noHBand="0" w:noVBand="1"/>
       </w:tblPr>
       <w:tblGrid>
-        <w:gridCol w:w="3007"/>
-        <w:gridCol w:w="3022"/>
-        <w:gridCol w:w="2987"/>
+        <w:gridCol w:w="1555"/>
+        <w:gridCol w:w="4110"/>
+        <w:gridCol w:w="3351"/>
       </w:tblGrid>
       <w:tr>
         <w:tc>
           <w:tcPr>
-            <w:tcW w:w="3216" w:type="dxa"/>
+            <w:tcW w:w="1555" w:type="dxa"/>
           </w:tcPr>
           <w:p/>
         </w:tc>
         <w:tc>
           <w:tcPr>
-            <w:tcW w:w="3216" w:type="dxa"/>
+            <w:tcW w:w="4110" w:type="dxa"/>
           </w:tcPr>
           <w:p>
             <w:r>
@@ -3211,7 +3211,7 @@
         </w:tc>
         <w:tc>
           <w:tcPr>
-            <w:tcW w:w="3216" w:type="dxa"/>
+            <w:tcW w:w="3351" w:type="dxa"/>
           </w:tcPr>
           <w:p>
             <w:r>
@@ -3228,7 +3228,7 @@
       <w:tr>
         <w:tc>
           <w:tcPr>
-            <w:tcW w:w="3216" w:type="dxa"/>
+            <w:tcW w:w="1555" w:type="dxa"/>
           </w:tcPr>
           <w:p>
             <w:r>
@@ -3251,7 +3251,7 @@
         </w:tc>
         <w:tc>
           <w:tcPr>
-            <w:tcW w:w="3216" w:type="dxa"/>
+            <w:tcW w:w="4110" w:type="dxa"/>
           </w:tcPr>
           <w:p>
             <w:r>
@@ -3265,7 +3265,7 @@
         </w:tc>
         <w:tc>
           <w:tcPr>
-            <w:tcW w:w="3216" w:type="dxa"/>
+            <w:tcW w:w="3351" w:type="dxa"/>
           </w:tcPr>
           <w:p>
             <w:r>
@@ -3281,7 +3281,7 @@
       <w:tr>
         <w:tc>
           <w:tcPr>
-            <w:tcW w:w="3216" w:type="dxa"/>
+            <w:tcW w:w="1555" w:type="dxa"/>
           </w:tcPr>
           <w:p>
             <w:r>
@@ -3295,7 +3295,7 @@
         </w:tc>
         <w:tc>
           <w:tcPr>
-            <w:tcW w:w="3216" w:type="dxa"/>
+            <w:tcW w:w="4110" w:type="dxa"/>
           </w:tcPr>
           <w:p>
             <w:r>
@@ -3309,7 +3309,7 @@
         </w:tc>
         <w:tc>
           <w:tcPr>
-            <w:tcW w:w="3216" w:type="dxa"/>
+            <w:tcW w:w="3351" w:type="dxa"/>
           </w:tcPr>
           <w:p>
             <w:r>
@@ -3325,7 +3325,7 @@
       <w:tr>
         <w:tc>
           <w:tcPr>
-            <w:tcW w:w="3216" w:type="dxa"/>
+            <w:tcW w:w="1555" w:type="dxa"/>
           </w:tcPr>
           <w:p>
             <w:r>
@@ -3339,7 +3339,7 @@
         </w:tc>
         <w:tc>
           <w:tcPr>
-            <w:tcW w:w="3216" w:type="dxa"/>
+            <w:tcW w:w="4110" w:type="dxa"/>
           </w:tcPr>
           <w:p>
             <w:r>
@@ -3353,7 +3353,7 @@
         </w:tc>
         <w:tc>
           <w:tcPr>
-            <w:tcW w:w="3216" w:type="dxa"/>
+            <w:tcW w:w="3351" w:type="dxa"/>
           </w:tcPr>
           <w:p>
             <w:r>
@@ -3384,13 +3384,59 @@
           <w:lang w:val="en-US"/>
         </w:rPr>
       </w:pPr>
-      <w:proofErr w:type="spellStart"/>
-      <w:r>
+    </w:p>
+    <w:p>
+      <w:pPr>
         <w:rPr>
           <w:b/>
           <w:bCs/>
           <w:lang w:val="en-US"/>
         </w:rPr>
+      </w:pPr>
+    </w:p>
+    <w:p>
+      <w:pPr>
+        <w:rPr>
+          <w:b/>
+          <w:bCs/>
+          <w:lang w:val="en-US"/>
+        </w:rPr>
+      </w:pPr>
+    </w:p>
+    <w:p>
+      <w:pPr>
+        <w:rPr>
+          <w:b/>
+          <w:bCs/>
+          <w:lang w:val="en-US"/>
+        </w:rPr>
+      </w:pPr>
+    </w:p>
+    <w:p>
+      <w:pPr>
+        <w:rPr>
+          <w:b/>
+          <w:bCs/>
+          <w:lang w:val="en-US"/>
+        </w:rPr>
+      </w:pPr>
+    </w:p>
+    <w:p>
+      <w:pPr>
+        <w:rPr>
+          <w:b/>
+          <w:bCs/>
+          <w:lang w:val="en-US"/>
+        </w:rPr>
+      </w:pPr>
+      <w:proofErr w:type="spellStart"/>
+      <w:r>
+        <w:rPr>
+          <w:b/>
+          <w:bCs/>
+          <w:lang w:val="en-US"/>
+        </w:rPr>
+        <w:lastRenderedPageBreak/>
         <w:t>Comparision</w:t>
       </w:r>
       <w:proofErr w:type="spellEnd"/>
@@ -5299,6 +5345,7 @@
   <w:style w:type="character" w:default="1" w:styleId="DefaultParagraphFont">
     <w:name w:val="Default Paragraph Font"/>
     <w:uiPriority w:val="1"/>
+    <w:semiHidden/>
     <w:unhideWhenUsed/>
   </w:style>
   <w:style w:type="table" w:default="1" w:styleId="TableNormal">
@@ -5949,23 +5996,10 @@
 </file>
 
 <file path=customXml/item1.xml><?xml version="1.0" encoding="utf-8"?>
-<p:properties xmlns:p="http://schemas.microsoft.com/office/2006/metadata/properties" xmlns:xsi="http://www.w3.org/2001/XMLSchema-instance" xmlns:pc="http://schemas.microsoft.com/office/infopath/2007/PartnerControls">
-  <documentManagement>
-    <_activity xmlns="1f251c7f-b30c-4aa8-9ee9-2063a7b1c354" xsi:nil="true"/>
-  </documentManagement>
-</p:properties>
+<b:Sources xmlns:b="http://schemas.openxmlformats.org/officeDocument/2006/bibliography" xmlns="http://schemas.openxmlformats.org/officeDocument/2006/bibliography" SelectedStyle="\APASixthEditionOfficeOnline.xsl" StyleName="APA" Version="6"/>
 </file>
 
 <file path=customXml/item2.xml><?xml version="1.0" encoding="utf-8"?>
-<?mso-contentType ?>
-<FormTemplates xmlns="http://schemas.microsoft.com/sharepoint/v3/contenttype/forms">
-  <Display>DocumentLibraryForm</Display>
-  <Edit>DocumentLibraryForm</Edit>
-  <New>DocumentLibraryForm</New>
-</FormTemplates>
-</file>
-
-<file path=customXml/item3.xml><?xml version="1.0" encoding="utf-8"?>
 <ct:contentTypeSchema xmlns:ct="http://schemas.microsoft.com/office/2006/metadata/contentType" xmlns:ma="http://schemas.microsoft.com/office/2006/metadata/properties/metaAttributes" ct:_="" ma:_="" ma:contentTypeName="Document" ma:contentTypeID="0x0101009B7547517AA2294DAC1FDB2CA1987608" ma:contentTypeVersion="5" ma:contentTypeDescription="Create a new document." ma:contentTypeScope="" ma:versionID="a293527282e1c90382ea0ce5be2125cd">
   <xsd:schema xmlns:xsd="http://www.w3.org/2001/XMLSchema" xmlns:xs="http://www.w3.org/2001/XMLSchema" xmlns:p="http://schemas.microsoft.com/office/2006/metadata/properties" xmlns:ns3="1f251c7f-b30c-4aa8-9ee9-2063a7b1c354" targetNamespace="http://schemas.microsoft.com/office/2006/metadata/properties" ma:root="true" ma:fieldsID="13a1dd675fc547cd230efa8c06d48c6f" ns3:_="">
     <xsd:import namespace="1f251c7f-b30c-4aa8-9ee9-2063a7b1c354"/>
@@ -6115,29 +6149,32 @@
 </ct:contentTypeSchema>
 </file>
 
+<file path=customXml/item3.xml><?xml version="1.0" encoding="utf-8"?>
+<?mso-contentType ?>
+<FormTemplates xmlns="http://schemas.microsoft.com/sharepoint/v3/contenttype/forms">
+  <Display>DocumentLibraryForm</Display>
+  <Edit>DocumentLibraryForm</Edit>
+  <New>DocumentLibraryForm</New>
+</FormTemplates>
+</file>
+
 <file path=customXml/item4.xml><?xml version="1.0" encoding="utf-8"?>
-<b:Sources xmlns:b="http://schemas.openxmlformats.org/officeDocument/2006/bibliography" xmlns="http://schemas.openxmlformats.org/officeDocument/2006/bibliography" SelectedStyle="\APASixthEditionOfficeOnline.xsl" StyleName="APA" Version="6"/>
+<p:properties xmlns:p="http://schemas.microsoft.com/office/2006/metadata/properties" xmlns:xsi="http://www.w3.org/2001/XMLSchema-instance" xmlns:pc="http://schemas.microsoft.com/office/infopath/2007/PartnerControls">
+  <documentManagement>
+    <_activity xmlns="1f251c7f-b30c-4aa8-9ee9-2063a7b1c354" xsi:nil="true"/>
+  </documentManagement>
+</p:properties>
 </file>
 
 <file path=customXml/itemProps1.xml><?xml version="1.0" encoding="utf-8"?>
-<ds:datastoreItem xmlns:ds="http://schemas.openxmlformats.org/officeDocument/2006/customXml" ds:itemID="{6BB7FE87-F08E-41F8-A601-3BBA2441393C}">
+<ds:datastoreItem xmlns:ds="http://schemas.openxmlformats.org/officeDocument/2006/customXml" ds:itemID="{CBD11C8B-7877-4F5A-947E-1C561BE12CE9}">
   <ds:schemaRefs>
-    <ds:schemaRef ds:uri="http://schemas.microsoft.com/office/2006/metadata/properties"/>
-    <ds:schemaRef ds:uri="http://schemas.microsoft.com/office/infopath/2007/PartnerControls"/>
-    <ds:schemaRef ds:uri="1f251c7f-b30c-4aa8-9ee9-2063a7b1c354"/>
+    <ds:schemaRef ds:uri="http://schemas.openxmlformats.org/officeDocument/2006/bibliography"/>
   </ds:schemaRefs>
 </ds:datastoreItem>
 </file>
 
 <file path=customXml/itemProps2.xml><?xml version="1.0" encoding="utf-8"?>
-<ds:datastoreItem xmlns:ds="http://schemas.openxmlformats.org/officeDocument/2006/customXml" ds:itemID="{9AFF74B0-9E58-41D4-891F-020AA06363C7}">
-  <ds:schemaRefs>
-    <ds:schemaRef ds:uri="http://schemas.microsoft.com/sharepoint/v3/contenttype/forms"/>
-  </ds:schemaRefs>
-</ds:datastoreItem>
-</file>
-
-<file path=customXml/itemProps3.xml><?xml version="1.0" encoding="utf-8"?>
 <ds:datastoreItem xmlns:ds="http://schemas.openxmlformats.org/officeDocument/2006/customXml" ds:itemID="{1067E973-60C8-46D9-AB04-2A2E33A2FD87}">
   <ds:schemaRefs>
     <ds:schemaRef ds:uri="http://schemas.microsoft.com/office/2006/metadata/contentType"/>
@@ -6155,10 +6192,20 @@
 </ds:datastoreItem>
 </file>
 
+<file path=customXml/itemProps3.xml><?xml version="1.0" encoding="utf-8"?>
+<ds:datastoreItem xmlns:ds="http://schemas.openxmlformats.org/officeDocument/2006/customXml" ds:itemID="{9AFF74B0-9E58-41D4-891F-020AA06363C7}">
+  <ds:schemaRefs>
+    <ds:schemaRef ds:uri="http://schemas.microsoft.com/sharepoint/v3/contenttype/forms"/>
+  </ds:schemaRefs>
+</ds:datastoreItem>
+</file>
+
 <file path=customXml/itemProps4.xml><?xml version="1.0" encoding="utf-8"?>
-<ds:datastoreItem xmlns:ds="http://schemas.openxmlformats.org/officeDocument/2006/customXml" ds:itemID="{CBD11C8B-7877-4F5A-947E-1C561BE12CE9}">
+<ds:datastoreItem xmlns:ds="http://schemas.openxmlformats.org/officeDocument/2006/customXml" ds:itemID="{6BB7FE87-F08E-41F8-A601-3BBA2441393C}">
   <ds:schemaRefs>
-    <ds:schemaRef ds:uri="http://schemas.openxmlformats.org/officeDocument/2006/bibliography"/>
+    <ds:schemaRef ds:uri="http://schemas.microsoft.com/office/2006/metadata/properties"/>
+    <ds:schemaRef ds:uri="http://schemas.microsoft.com/office/infopath/2007/PartnerControls"/>
+    <ds:schemaRef ds:uri="1f251c7f-b30c-4aa8-9ee9-2063a7b1c354"/>
   </ds:schemaRefs>
 </ds:datastoreItem>
 </file>
</xml_diff>

<commit_message>
Replace scattered stage guides with single ROADMAP for SAR-LC-Bench project.
Consolidate planning into ROADMAP.md (three phases, paper reading order, v0.2 results). Remove outdated comparison and stage guides, add reference papers and SAR research brief, and update README/RUNBOOK pointers.
</commit_message>
<xml_diff>
--- a/DataSET.docx
+++ b/DataSET.docx
@@ -198,29 +198,13 @@
           <w:bCs/>
           <w:lang w:val="en-US"/>
         </w:rPr>
-        <w:t>What Created</w:t>
-      </w:r>
-      <w:proofErr w:type="gramStart"/>
-      <w:r>
-        <w:rPr>
-          <w:b/>
-          <w:bCs/>
+        <w:t>What Created:</w:t>
+      </w:r>
+      <w:r>
+        <w:rPr>
           <w:lang w:val="en-US"/>
         </w:rPr>
-        <w:t>:</w:t>
-      </w:r>
-      <w:r>
-        <w:rPr>
-          <w:lang w:val="en-US"/>
-        </w:rPr>
-        <w:t xml:space="preserve">  (</w:t>
-      </w:r>
-      <w:proofErr w:type="gramEnd"/>
-      <w:r>
-        <w:rPr>
-          <w:lang w:val="en-US"/>
-        </w:rPr>
-        <w:t>Used: label and .tiff)</w:t>
+        <w:t xml:space="preserve">  (Used: label and .tiff)</w:t>
       </w:r>
     </w:p>
     <w:p>
@@ -675,21 +659,12 @@
                 <w:bCs/>
               </w:rPr>
             </w:pPr>
-            <w:proofErr w:type="gramStart"/>
             <w:r>
               <w:rPr>
                 <w:b/>
                 <w:bCs/>
               </w:rPr>
-              <w:t>Classification:F</w:t>
-            </w:r>
-            <w:proofErr w:type="gramEnd"/>
-            <w:r>
-              <w:rPr>
-                <w:b/>
-                <w:bCs/>
-              </w:rPr>
-              <w:t>1</w:t>
+              <w:t>Classification:F1</w:t>
             </w:r>
           </w:p>
         </w:tc>
@@ -1527,7 +1502,7 @@
           </w:tcPr>
           <w:p>
             <w:r>
-              <w:t>First VLM instruction + eval protocol on AI4LCC S1 VH with official 14-class OCSGE (classify + dialogue)</w:t>
+              <w:t>VLM instruction + eval on AI4LCC S1 VH with official 14-class OCSGE (classify + dialogue)</w:t>
             </w:r>
           </w:p>
         </w:tc>
@@ -2240,20 +2215,19 @@
         <w:rPr>
           <w:rFonts w:ascii="Calibri" w:hAnsi="Calibri"/>
         </w:rPr>
-        <w:t xml:space="preserve">even with </w:t>
+        <w:t xml:space="preserve">The paper’s main </w:t>
       </w:r>
       <w:r>
         <w:rPr>
           <w:rFonts w:ascii="Calibri" w:hAnsi="Calibri"/>
-          <w:b/>
-        </w:rPr>
-        <w:t>optical</w:t>
+        </w:rPr>
+        <w:t xml:space="preserve">contribution </w:t>
       </w:r>
       <w:r>
         <w:rPr>
           <w:rFonts w:ascii="Calibri" w:hAnsi="Calibri"/>
         </w:rPr>
-        <w:t xml:space="preserve"> S2, fine urban classes are hard. The paper’s main gift is the </w:t>
+        <w:t xml:space="preserve">is the </w:t>
       </w:r>
       <w:r>
         <w:rPr>
@@ -2812,7 +2786,7 @@
           <w:rFonts w:ascii="Calibri" w:hAnsi="Calibri"/>
           <w:b/>
         </w:rPr>
-        <w:t>Selected results (their Table 2 — CNN pixel metrics):</w:t>
+        <w:t>Selected results (Table 2 — CNN pixel metrics):</w:t>
       </w:r>
     </w:p>
     <w:tbl>
@@ -3456,20 +3430,20 @@
         <w:tblLook w:val="04A0" w:firstRow="1" w:lastRow="0" w:firstColumn="1" w:lastColumn="0" w:noHBand="0" w:noVBand="1"/>
       </w:tblPr>
       <w:tblGrid>
-        <w:gridCol w:w="1129"/>
-        <w:gridCol w:w="4253"/>
+        <w:gridCol w:w="1413"/>
+        <w:gridCol w:w="3969"/>
         <w:gridCol w:w="3634"/>
       </w:tblGrid>
       <w:tr>
         <w:tc>
           <w:tcPr>
-            <w:tcW w:w="1129" w:type="dxa"/>
+            <w:tcW w:w="1413" w:type="dxa"/>
           </w:tcPr>
           <w:p/>
         </w:tc>
         <w:tc>
           <w:tcPr>
-            <w:tcW w:w="4253" w:type="dxa"/>
+            <w:tcW w:w="3969" w:type="dxa"/>
           </w:tcPr>
           <w:p>
             <w:r>
@@ -3501,7 +3475,7 @@
       <w:tr>
         <w:tc>
           <w:tcPr>
-            <w:tcW w:w="1129" w:type="dxa"/>
+            <w:tcW w:w="1413" w:type="dxa"/>
           </w:tcPr>
           <w:p>
             <w:r>
@@ -3516,7 +3490,7 @@
         </w:tc>
         <w:tc>
           <w:tcPr>
-            <w:tcW w:w="4253" w:type="dxa"/>
+            <w:tcW w:w="3969" w:type="dxa"/>
           </w:tcPr>
           <w:p>
             <w:r>
@@ -3599,7 +3573,7 @@
       <w:tr>
         <w:tc>
           <w:tcPr>
-            <w:tcW w:w="1129" w:type="dxa"/>
+            <w:tcW w:w="1413" w:type="dxa"/>
           </w:tcPr>
           <w:p>
             <w:r>
@@ -3614,7 +3588,7 @@
         </w:tc>
         <w:tc>
           <w:tcPr>
-            <w:tcW w:w="4253" w:type="dxa"/>
+            <w:tcW w:w="3969" w:type="dxa"/>
           </w:tcPr>
           <w:p>
             <w:r>
@@ -3644,7 +3618,7 @@
       <w:tr>
         <w:tc>
           <w:tcPr>
-            <w:tcW w:w="1129" w:type="dxa"/>
+            <w:tcW w:w="1413" w:type="dxa"/>
           </w:tcPr>
           <w:p>
             <w:r>
@@ -3659,7 +3633,7 @@
         </w:tc>
         <w:tc>
           <w:tcPr>
-            <w:tcW w:w="4253" w:type="dxa"/>
+            <w:tcW w:w="3969" w:type="dxa"/>
           </w:tcPr>
           <w:p>
             <w:r>
@@ -3742,7 +3716,7 @@
       <w:tr>
         <w:tc>
           <w:tcPr>
-            <w:tcW w:w="1129" w:type="dxa"/>
+            <w:tcW w:w="1413" w:type="dxa"/>
           </w:tcPr>
           <w:p>
             <w:r>
@@ -3757,7 +3731,7 @@
         </w:tc>
         <w:tc>
           <w:tcPr>
-            <w:tcW w:w="4253" w:type="dxa"/>
+            <w:tcW w:w="3969" w:type="dxa"/>
           </w:tcPr>
           <w:p>
             <w:r>
@@ -3832,7 +3806,7 @@
       <w:tr>
         <w:tc>
           <w:tcPr>
-            <w:tcW w:w="1129" w:type="dxa"/>
+            <w:tcW w:w="1413" w:type="dxa"/>
           </w:tcPr>
           <w:p>
             <w:r>
@@ -3847,7 +3821,7 @@
         </w:tc>
         <w:tc>
           <w:tcPr>
-            <w:tcW w:w="4253" w:type="dxa"/>
+            <w:tcW w:w="3969" w:type="dxa"/>
           </w:tcPr>
           <w:p>
             <w:r>
@@ -3916,7 +3890,7 @@
       <w:tr>
         <w:tc>
           <w:tcPr>
-            <w:tcW w:w="1129" w:type="dxa"/>
+            <w:tcW w:w="1413" w:type="dxa"/>
           </w:tcPr>
           <w:p>
             <w:r>
@@ -3931,7 +3905,7 @@
         </w:tc>
         <w:tc>
           <w:tcPr>
-            <w:tcW w:w="4253" w:type="dxa"/>
+            <w:tcW w:w="3969" w:type="dxa"/>
           </w:tcPr>
           <w:p>
             <w:r>
@@ -4007,7 +3981,7 @@
       <w:tr>
         <w:tc>
           <w:tcPr>
-            <w:tcW w:w="1129" w:type="dxa"/>
+            <w:tcW w:w="1413" w:type="dxa"/>
           </w:tcPr>
           <w:p>
             <w:r>
@@ -4022,7 +3996,7 @@
         </w:tc>
         <w:tc>
           <w:tcPr>
-            <w:tcW w:w="4253" w:type="dxa"/>
+            <w:tcW w:w="3969" w:type="dxa"/>
           </w:tcPr>
           <w:p>
             <w:r>
@@ -4119,16 +4093,8 @@
         <w:rPr>
           <w:lang w:val="en-US"/>
         </w:rPr>
-        <w:t xml:space="preserve">not </w:t>
-      </w:r>
-      <w:proofErr w:type="spellStart"/>
-      <w:r>
-        <w:rPr>
-          <w:lang w:val="en-US"/>
-        </w:rPr>
-        <w:t>ccomparable</w:t>
-      </w:r>
-      <w:proofErr w:type="spellEnd"/>
+        <w:t>not comparable</w:t>
+      </w:r>
       <w:r>
         <w:rPr>
           <w:b/>
@@ -5996,10 +5962,23 @@
 </file>
 
 <file path=customXml/item1.xml><?xml version="1.0" encoding="utf-8"?>
-<b:Sources xmlns:b="http://schemas.openxmlformats.org/officeDocument/2006/bibliography" xmlns="http://schemas.openxmlformats.org/officeDocument/2006/bibliography" SelectedStyle="\APASixthEditionOfficeOnline.xsl" StyleName="APA" Version="6"/>
+<p:properties xmlns:p="http://schemas.microsoft.com/office/2006/metadata/properties" xmlns:xsi="http://www.w3.org/2001/XMLSchema-instance" xmlns:pc="http://schemas.microsoft.com/office/infopath/2007/PartnerControls">
+  <documentManagement>
+    <_activity xmlns="1f251c7f-b30c-4aa8-9ee9-2063a7b1c354" xsi:nil="true"/>
+  </documentManagement>
+</p:properties>
 </file>
 
 <file path=customXml/item2.xml><?xml version="1.0" encoding="utf-8"?>
+<?mso-contentType ?>
+<FormTemplates xmlns="http://schemas.microsoft.com/sharepoint/v3/contenttype/forms">
+  <Display>DocumentLibraryForm</Display>
+  <Edit>DocumentLibraryForm</Edit>
+  <New>DocumentLibraryForm</New>
+</FormTemplates>
+</file>
+
+<file path=customXml/item3.xml><?xml version="1.0" encoding="utf-8"?>
 <ct:contentTypeSchema xmlns:ct="http://schemas.microsoft.com/office/2006/metadata/contentType" xmlns:ma="http://schemas.microsoft.com/office/2006/metadata/properties/metaAttributes" ct:_="" ma:_="" ma:contentTypeName="Document" ma:contentTypeID="0x0101009B7547517AA2294DAC1FDB2CA1987608" ma:contentTypeVersion="5" ma:contentTypeDescription="Create a new document." ma:contentTypeScope="" ma:versionID="a293527282e1c90382ea0ce5be2125cd">
   <xsd:schema xmlns:xsd="http://www.w3.org/2001/XMLSchema" xmlns:xs="http://www.w3.org/2001/XMLSchema" xmlns:p="http://schemas.microsoft.com/office/2006/metadata/properties" xmlns:ns3="1f251c7f-b30c-4aa8-9ee9-2063a7b1c354" targetNamespace="http://schemas.microsoft.com/office/2006/metadata/properties" ma:root="true" ma:fieldsID="13a1dd675fc547cd230efa8c06d48c6f" ns3:_="">
     <xsd:import namespace="1f251c7f-b30c-4aa8-9ee9-2063a7b1c354"/>
@@ -6149,32 +6128,29 @@
 </ct:contentTypeSchema>
 </file>
 
-<file path=customXml/item3.xml><?xml version="1.0" encoding="utf-8"?>
-<?mso-contentType ?>
-<FormTemplates xmlns="http://schemas.microsoft.com/sharepoint/v3/contenttype/forms">
-  <Display>DocumentLibraryForm</Display>
-  <Edit>DocumentLibraryForm</Edit>
-  <New>DocumentLibraryForm</New>
-</FormTemplates>
-</file>
-
 <file path=customXml/item4.xml><?xml version="1.0" encoding="utf-8"?>
-<p:properties xmlns:p="http://schemas.microsoft.com/office/2006/metadata/properties" xmlns:xsi="http://www.w3.org/2001/XMLSchema-instance" xmlns:pc="http://schemas.microsoft.com/office/infopath/2007/PartnerControls">
-  <documentManagement>
-    <_activity xmlns="1f251c7f-b30c-4aa8-9ee9-2063a7b1c354" xsi:nil="true"/>
-  </documentManagement>
-</p:properties>
+<b:Sources xmlns:b="http://schemas.openxmlformats.org/officeDocument/2006/bibliography" xmlns="http://schemas.openxmlformats.org/officeDocument/2006/bibliography" SelectedStyle="\APASixthEditionOfficeOnline.xsl" StyleName="APA" Version="6"/>
 </file>
 
 <file path=customXml/itemProps1.xml><?xml version="1.0" encoding="utf-8"?>
-<ds:datastoreItem xmlns:ds="http://schemas.openxmlformats.org/officeDocument/2006/customXml" ds:itemID="{CBD11C8B-7877-4F5A-947E-1C561BE12CE9}">
+<ds:datastoreItem xmlns:ds="http://schemas.openxmlformats.org/officeDocument/2006/customXml" ds:itemID="{6BB7FE87-F08E-41F8-A601-3BBA2441393C}">
   <ds:schemaRefs>
-    <ds:schemaRef ds:uri="http://schemas.openxmlformats.org/officeDocument/2006/bibliography"/>
+    <ds:schemaRef ds:uri="http://schemas.microsoft.com/office/2006/metadata/properties"/>
+    <ds:schemaRef ds:uri="http://schemas.microsoft.com/office/infopath/2007/PartnerControls"/>
+    <ds:schemaRef ds:uri="1f251c7f-b30c-4aa8-9ee9-2063a7b1c354"/>
   </ds:schemaRefs>
 </ds:datastoreItem>
 </file>
 
 <file path=customXml/itemProps2.xml><?xml version="1.0" encoding="utf-8"?>
+<ds:datastoreItem xmlns:ds="http://schemas.openxmlformats.org/officeDocument/2006/customXml" ds:itemID="{9AFF74B0-9E58-41D4-891F-020AA06363C7}">
+  <ds:schemaRefs>
+    <ds:schemaRef ds:uri="http://schemas.microsoft.com/sharepoint/v3/contenttype/forms"/>
+  </ds:schemaRefs>
+</ds:datastoreItem>
+</file>
+
+<file path=customXml/itemProps3.xml><?xml version="1.0" encoding="utf-8"?>
 <ds:datastoreItem xmlns:ds="http://schemas.openxmlformats.org/officeDocument/2006/customXml" ds:itemID="{1067E973-60C8-46D9-AB04-2A2E33A2FD87}">
   <ds:schemaRefs>
     <ds:schemaRef ds:uri="http://schemas.microsoft.com/office/2006/metadata/contentType"/>
@@ -6192,20 +6168,10 @@
 </ds:datastoreItem>
 </file>
 
-<file path=customXml/itemProps3.xml><?xml version="1.0" encoding="utf-8"?>
-<ds:datastoreItem xmlns:ds="http://schemas.openxmlformats.org/officeDocument/2006/customXml" ds:itemID="{9AFF74B0-9E58-41D4-891F-020AA06363C7}">
+<file path=customXml/itemProps4.xml><?xml version="1.0" encoding="utf-8"?>
+<ds:datastoreItem xmlns:ds="http://schemas.openxmlformats.org/officeDocument/2006/customXml" ds:itemID="{CBD11C8B-7877-4F5A-947E-1C561BE12CE9}">
   <ds:schemaRefs>
-    <ds:schemaRef ds:uri="http://schemas.microsoft.com/sharepoint/v3/contenttype/forms"/>
-  </ds:schemaRefs>
-</ds:datastoreItem>
-</file>
-
-<file path=customXml/itemProps4.xml><?xml version="1.0" encoding="utf-8"?>
-<ds:datastoreItem xmlns:ds="http://schemas.openxmlformats.org/officeDocument/2006/customXml" ds:itemID="{6BB7FE87-F08E-41F8-A601-3BBA2441393C}">
-  <ds:schemaRefs>
-    <ds:schemaRef ds:uri="http://schemas.microsoft.com/office/2006/metadata/properties"/>
-    <ds:schemaRef ds:uri="http://schemas.microsoft.com/office/infopath/2007/PartnerControls"/>
-    <ds:schemaRef ds:uri="1f251c7f-b30c-4aa8-9ee9-2063a7b1c354"/>
+    <ds:schemaRef ds:uri="http://schemas.openxmlformats.org/officeDocument/2006/bibliography"/>
   </ds:schemaRefs>
 </ds:datastoreItem>
 </file>
</xml_diff>